<commit_message>
Cập nhật gitignore: loại bỏ thư mục .agent khỏi mã nguồn dự án và chuẩn bị mã nguồn đưa lên GitHub
</commit_message>
<xml_diff>
--- a/đưa lên github và supabase.docx
+++ b/đưa lên github và supabase.docx
@@ -16,6 +16,25 @@
           <w:t>https://github.com/bopv2848/DUOI-HINH-BAT-CHU</w:t>
         </w:r>
       </w:hyperlink>
+    </w:p>
+    <w:p>
+      <w:pPr>
+        <w:spacing w:line="240" w:lineRule="auto"/>
+        <w:rPr>
+          <w:rFonts w:eastAsia="Times New Roman" w:cs="Times New Roman"/>
+          <w:kern w:val="0"/>
+          <w14:ligatures w14:val="none"/>
+        </w:rPr>
+      </w:pPr>
+      <w:r>
+        <w:rPr>
+          <w:rFonts w:eastAsia="Times New Roman" w:cs="Times New Roman"/>
+          <w:color w:val="EB5757"/>
+          <w:kern w:val="0"/>
+          <w14:ligatures w14:val="none"/>
+        </w:rPr>
+        <w:t>Thêm tên folder .Agent vào .gitignore và ko đưa lên github</w:t>
+      </w:r>
     </w:p>
     <w:p/>
     <w:p/>

</xml_diff>